<commit_message>
oknb docx: 12 pt on a 24 pt pitch as typst sets them (the committed reference.docx was 13 pt on 26 pt lines, an EB Garamond leftover)
Sizes and spacings in styles.xml scaled by 12/13 (body 24 half points, exact lines 480 and 276 twips, heading,
quotation and footnote spaces likewise). docx check.sh: adversary complaint and motion brief 10 passed, 0 failed, as
before (XENG-001..003 report only). (fb-595.68.39)
</commit_message>
<xml_diff>
--- a/courts/tenth-circuit/oklahoma/federal/bankruptcy-northern-district/adversary-complaint/docx/reference.docx
+++ b/courts/tenth-circuit/oklahoma/federal/bankruptcy-northern-district/adversary-complaint/docx/reference.docx
@@ -212,8 +212,8 @@
     <w:rPrDefault>
       <w:rPr>
         <w:rFonts w:ascii="Times New Roman" w:hAnsi="Times New Roman" w:eastAsia="Times New Roman" w:cs="Times New Roman"/>
-        <w:sz w:val="26"/>
-        <w:szCs w:val="26"/>
+        <w:sz w:val="24"/>
+        <w:szCs w:val="24"/>
         <w:lang w:val="en-US" w:eastAsia="en-US" w:bidi="ar-SA"/>
       </w:rPr>
     </w:rPrDefault>
@@ -232,8 +232,8 @@
     </w:pPr>
     <w:rPr>
       <w:rFonts w:ascii="Times New Roman" w:hAnsi="Times New Roman" w:cs="Times New Roman"/>
-      <w:sz w:val="26"/>
-      <w:szCs w:val="26"/>
+      <w:sz w:val="24"/>
+      <w:szCs w:val="24"/>
     </w:rPr>
   </w:style>
   <w:style w:type="paragraph" w:styleId="BodyText">
@@ -241,7 +241,7 @@
     <w:basedOn w:val="Normal"/>
     <w:qFormat/>
     <w:pPr>
-      <w:spacing w:before="0" w:after="0" w:line="520" w:lineRule="exact"/>
+      <w:spacing w:before="0" w:after="0" w:line="480" w:lineRule="exact"/>
       <w:ind w:firstLine="720"/>
     </w:pPr>
   </w:style>
@@ -267,13 +267,13 @@
     <w:pPr>
       <w:keepNext/>
       <w:keepLines/>
-      <w:spacing w:before="0" w:after="0" w:line="520" w:lineRule="exact"/>
+      <w:spacing w:before="0" w:after="0" w:line="480" w:lineRule="exact"/>
       <w:jc w:val="center"/>
     </w:pPr>
     <w:rPr>
       <w:b/>
-      <w:sz w:val="26"/>
-      <w:szCs w:val="26"/>
+      <w:sz w:val="24"/>
+      <w:szCs w:val="24"/>
     </w:rPr>
   </w:style>
   <w:style w:type="paragraph" w:styleId="Subtitle">
@@ -332,15 +332,15 @@
     <w:pPr>
       <w:keepNext/>
       <w:keepLines/>
-      <w:spacing w:before="351" w:after="0" w:line="520" w:lineRule="exact"/>
+      <w:spacing w:before="324" w:after="0" w:line="480" w:lineRule="exact"/>
       <w:jc w:val="center"/>
       <w:outlineLvl w:val="0"/>
     </w:pPr>
     <w:rPr>
       <w:b/>
       <w:caps/>
-      <w:sz w:val="26"/>
-      <w:szCs w:val="26"/>
+      <w:sz w:val="24"/>
+      <w:szCs w:val="24"/>
     </w:rPr>
   </w:style>
   <w:style w:type="paragraph" w:styleId="Heading2">
@@ -351,14 +351,14 @@
     <w:pPr>
       <w:keepNext/>
       <w:keepLines/>
-      <w:spacing w:before="351" w:after="0" w:line="520" w:lineRule="exact"/>
+      <w:spacing w:before="324" w:after="0" w:line="480" w:lineRule="exact"/>
       <w:jc w:val="center"/>
       <w:outlineLvl w:val="1"/>
     </w:pPr>
     <w:rPr>
       <w:b/>
-      <w:sz w:val="26"/>
-      <w:szCs w:val="26"/>
+      <w:sz w:val="24"/>
+      <w:szCs w:val="24"/>
     </w:rPr>
   </w:style>
   <w:style w:type="paragraph" w:styleId="Heading3">
@@ -369,15 +369,15 @@
     <w:pPr>
       <w:keepNext/>
       <w:keepLines/>
-      <w:spacing w:before="351" w:after="0" w:line="520" w:lineRule="exact"/>
+      <w:spacing w:before="324" w:after="0" w:line="480" w:lineRule="exact"/>
       <w:jc w:val="left"/>
       <w:outlineLvl w:val="2"/>
     </w:pPr>
     <w:rPr>
       <w:b/>
       <w:i/>
-      <w:sz w:val="26"/>
-      <w:szCs w:val="26"/>
+      <w:sz w:val="24"/>
+      <w:szCs w:val="24"/>
     </w:rPr>
   </w:style>
   <w:style w:type="paragraph" w:styleId="Heading4">
@@ -413,7 +413,7 @@
     <w:next w:val="BodyText"/>
     <w:qFormat/>
     <w:pPr>
-      <w:spacing w:before="260" w:after="260" w:line="299" w:lineRule="exact"/>
+      <w:spacing w:before="240" w:after="240" w:line="276" w:lineRule="exact"/>
       <w:ind w:left="720" w:right="720" w:firstLine="0"/>
     </w:pPr>
   </w:style>
@@ -422,11 +422,11 @@
     <w:basedOn w:val="Normal"/>
     <w:qFormat/>
     <w:pPr>
-      <w:spacing w:before="0" w:after="130" w:line="299" w:lineRule="exact"/>
-    </w:pPr>
-    <w:rPr>
-      <w:sz w:val="26"/>
-      <w:szCs w:val="26"/>
+      <w:spacing w:before="0" w:after="120" w:line="276" w:lineRule="exact"/>
+    </w:pPr>
+    <w:rPr>
+      <w:sz w:val="24"/>
+      <w:szCs w:val="24"/>
     </w:rPr>
   </w:style>
   <w:style w:type="character" w:styleId="FootnoteReference">
@@ -441,7 +441,7 @@
     <w:next w:val="BodyText"/>
     <w:qFormat/>
     <w:pPr>
-      <w:spacing w:before="0" w:after="0" w:line="299" w:lineRule="exact"/>
+      <w:spacing w:before="0" w:after="0" w:line="276" w:lineRule="exact"/>
     </w:pPr>
   </w:style>
   <w:style w:type="paragraph" w:customStyle="1" w:styleId="TableCaption">
@@ -484,8 +484,8 @@
       <w:jc w:val="center"/>
     </w:pPr>
     <w:rPr>
-      <w:sz w:val="26"/>
-      <w:szCs w:val="26"/>
+      <w:sz w:val="24"/>
+      <w:szCs w:val="24"/>
     </w:rPr>
   </w:style>
   <w:style w:type="paragraph" w:styleId="Header">
@@ -549,7 +549,7 @@
     <w:name w:val="Table"/>
     <w:basedOn w:val="TableNormal"/>
     <w:pPr>
-      <w:spacing w:before="0" w:after="0" w:line="299" w:lineRule="exact"/>
+      <w:spacing w:before="0" w:after="0" w:line="276" w:lineRule="exact"/>
     </w:pPr>
     <w:tblPr>
       <w:tblBorders>

</xml_diff>